<commit_message>
add : doip ssh fkvci api .md
</commit_message>
<xml_diff>
--- a/doc/软件著作/NetworkSwitch/NetworkSwitch_产品说明书.docx
+++ b/doc/软件著作/NetworkSwitch/NetworkSwitch_产品说明书.docx
@@ -674,8 +674,6 @@
         </w:rPr>
         <w:t>/MAC</w:t>
       </w:r>
-      <w:bookmarkStart w:id="0" w:name="_GoBack"/>
-      <w:bookmarkEnd w:id="0"/>
       <w:r>
         <w:rPr>
           <w:rFonts w:hint="eastAsia"/>
@@ -1226,7 +1224,13 @@
         <w:rPr>
           <w:lang w:eastAsia="zh-CN"/>
         </w:rPr>
-        <w:t>二、软件功能与特色</w:t>
+        <w:t>二、软件</w:t>
+      </w:r>
+      <w:r>
+        <w:rPr>
+          <w:lang w:eastAsia="zh-CN"/>
+        </w:rPr>
+        <w:t>特色</w:t>
       </w:r>
     </w:p>
     <w:p>
@@ -1710,6 +1714,182 @@
         </w:rPr>
         <w:t>Qt 5.14.2 + Visual Studio 2017</w:t>
       </w:r>
+    </w:p>
+    <w:p>
+      <w:pPr>
+        <w:spacing w:after="0" w:line="360" w:lineRule="auto"/>
+        <w:rPr>
+          <w:lang w:eastAsia="zh-CN"/>
+        </w:rPr>
+      </w:pPr>
+      <w:r>
+        <w:rPr>
+          <w:lang w:eastAsia="zh-CN"/>
+        </w:rPr>
+        <w:t>网</w:t>
+      </w:r>
+      <w:r>
+        <w:rPr>
+          <w:rFonts w:ascii="微软雅黑" w:eastAsia="微软雅黑" w:hAnsi="微软雅黑" w:cs="微软雅黑" w:hint="eastAsia"/>
+          <w:lang w:eastAsia="zh-CN"/>
+        </w:rPr>
+        <w:t>络</w:t>
+      </w:r>
+      <w:r>
+        <w:rPr>
+          <w:rFonts w:ascii="MS Gothic" w:eastAsia="MS Gothic" w:hAnsi="MS Gothic" w:cs="MS Gothic" w:hint="eastAsia"/>
+          <w:lang w:eastAsia="zh-CN"/>
+        </w:rPr>
+        <w:t>要求：</w:t>
+      </w:r>
+      <w:r>
+        <w:rPr>
+          <w:lang w:eastAsia="zh-CN"/>
+        </w:rPr>
+        <w:t>本机网卡</w:t>
+      </w:r>
+      <w:r>
+        <w:rPr>
+          <w:rFonts w:hint="eastAsia"/>
+          <w:lang w:eastAsia="zh-CN"/>
+        </w:rPr>
+        <w:t>IP</w:t>
+      </w:r>
+      <w:r>
+        <w:rPr>
+          <w:rFonts w:hint="eastAsia"/>
+          <w:lang w:eastAsia="zh-CN"/>
+        </w:rPr>
+        <w:t>与交</w:t>
+      </w:r>
+      <w:r>
+        <w:rPr>
+          <w:rFonts w:ascii="微软雅黑" w:eastAsia="微软雅黑" w:hAnsi="微软雅黑" w:cs="微软雅黑" w:hint="eastAsia"/>
+          <w:lang w:eastAsia="zh-CN"/>
+        </w:rPr>
+        <w:t>换</w:t>
+      </w:r>
+      <w:r>
+        <w:rPr>
+          <w:rFonts w:ascii="MS Gothic" w:eastAsia="MS Gothic" w:hAnsi="MS Gothic" w:cs="MS Gothic" w:hint="eastAsia"/>
+          <w:lang w:eastAsia="zh-CN"/>
+        </w:rPr>
+        <w:t>机</w:t>
+      </w:r>
+      <w:r>
+        <w:rPr>
+          <w:rFonts w:hint="eastAsia"/>
+          <w:lang w:eastAsia="zh-CN"/>
+        </w:rPr>
+        <w:t>在同一网段（</w:t>
+      </w:r>
+      <w:r>
+        <w:rPr>
+          <w:lang w:eastAsia="zh-CN"/>
+        </w:rPr>
+        <w:t>如交换机</w:t>
+      </w:r>
+      <w:r>
+        <w:rPr>
+          <w:lang w:eastAsia="zh-CN"/>
+        </w:rPr>
+        <w:t>IP</w:t>
+      </w:r>
+      <w:r>
+        <w:rPr>
+          <w:lang w:eastAsia="zh-CN"/>
+        </w:rPr>
+        <w:t>：</w:t>
+      </w:r>
+      <w:r>
+        <w:rPr>
+          <w:rFonts w:hint="eastAsia"/>
+          <w:lang w:eastAsia="zh-CN"/>
+        </w:rPr>
+        <w:t>1</w:t>
+      </w:r>
+      <w:r>
+        <w:rPr>
+          <w:lang w:eastAsia="zh-CN"/>
+        </w:rPr>
+        <w:t>92.168.1.120</w:t>
+      </w:r>
+      <w:r>
+        <w:rPr>
+          <w:lang w:eastAsia="zh-CN"/>
+        </w:rPr>
+        <w:t>，本机配置</w:t>
+      </w:r>
+      <w:r>
+        <w:rPr>
+          <w:lang w:eastAsia="zh-CN"/>
+        </w:rPr>
+        <w:t>IP</w:t>
+      </w:r>
+      <w:r>
+        <w:rPr>
+          <w:lang w:eastAsia="zh-CN"/>
+        </w:rPr>
+        <w:t>：</w:t>
+      </w:r>
+      <w:r>
+        <w:rPr>
+          <w:rFonts w:hint="eastAsia"/>
+          <w:lang w:eastAsia="zh-CN"/>
+        </w:rPr>
+        <w:t>1</w:t>
+      </w:r>
+      <w:r>
+        <w:rPr>
+          <w:lang w:eastAsia="zh-CN"/>
+        </w:rPr>
+        <w:t>92.168.1.50</w:t>
+      </w:r>
+      <w:r>
+        <w:rPr>
+          <w:lang w:eastAsia="zh-CN"/>
+        </w:rPr>
+        <w:t>），并确保可</w:t>
+      </w:r>
+      <w:r>
+        <w:rPr>
+          <w:lang w:eastAsia="zh-CN"/>
+        </w:rPr>
+        <w:t xml:space="preserve"> ping </w:t>
+      </w:r>
+      <w:r>
+        <w:rPr>
+          <w:lang w:eastAsia="zh-CN"/>
+        </w:rPr>
+        <w:t>通</w:t>
+      </w:r>
+      <w:r>
+        <w:rPr>
+          <w:rFonts w:hint="eastAsia"/>
+          <w:lang w:eastAsia="zh-CN"/>
+        </w:rPr>
+        <w:t>交</w:t>
+      </w:r>
+      <w:r>
+        <w:rPr>
+          <w:rFonts w:ascii="微软雅黑" w:eastAsia="微软雅黑" w:hAnsi="微软雅黑" w:cs="微软雅黑" w:hint="eastAsia"/>
+          <w:lang w:eastAsia="zh-CN"/>
+        </w:rPr>
+        <w:t>换</w:t>
+      </w:r>
+      <w:r>
+        <w:rPr>
+          <w:rFonts w:ascii="MS Gothic" w:eastAsia="MS Gothic" w:hAnsi="MS Gothic" w:cs="MS Gothic" w:hint="eastAsia"/>
+          <w:lang w:eastAsia="zh-CN"/>
+        </w:rPr>
+        <w:t>机</w:t>
+      </w:r>
+      <w:r>
+        <w:rPr>
+          <w:lang w:eastAsia="zh-CN"/>
+        </w:rPr>
+        <w:t>。</w:t>
+      </w:r>
       <w:r>
         <w:rPr>
           <w:lang w:eastAsia="zh-CN"/>
@@ -1817,192 +1997,6 @@
           <w:lang w:eastAsia="zh-CN"/>
         </w:rPr>
         <w:t>间</w:t>
-      </w:r>
-      <w:r>
-        <w:rPr>
-          <w:lang w:eastAsia="zh-CN"/>
-        </w:rPr>
-        <w:br/>
-      </w:r>
-      <w:r>
-        <w:rPr>
-          <w:lang w:eastAsia="zh-CN"/>
-        </w:rPr>
-        <w:t>网</w:t>
-      </w:r>
-      <w:r>
-        <w:rPr>
-          <w:rFonts w:ascii="微软雅黑" w:eastAsia="微软雅黑" w:hAnsi="微软雅黑" w:cs="微软雅黑" w:hint="eastAsia"/>
-          <w:lang w:eastAsia="zh-CN"/>
-        </w:rPr>
-        <w:t>络</w:t>
-      </w:r>
-      <w:r>
-        <w:rPr>
-          <w:rFonts w:ascii="MS Gothic" w:eastAsia="MS Gothic" w:hAnsi="MS Gothic" w:cs="MS Gothic" w:hint="eastAsia"/>
-          <w:lang w:eastAsia="zh-CN"/>
-        </w:rPr>
-        <w:t>要求：</w:t>
-      </w:r>
-      <w:r>
-        <w:rPr>
-          <w:lang w:eastAsia="zh-CN"/>
-        </w:rPr>
-        <w:t>本机网卡</w:t>
-      </w:r>
-      <w:r>
-        <w:rPr>
-          <w:rFonts w:hint="eastAsia"/>
-          <w:lang w:eastAsia="zh-CN"/>
-        </w:rPr>
-        <w:t>IP</w:t>
-      </w:r>
-      <w:r>
-        <w:rPr>
-          <w:rFonts w:hint="eastAsia"/>
-          <w:lang w:eastAsia="zh-CN"/>
-        </w:rPr>
-        <w:t>与交</w:t>
-      </w:r>
-      <w:r>
-        <w:rPr>
-          <w:rFonts w:ascii="微软雅黑" w:eastAsia="微软雅黑" w:hAnsi="微软雅黑" w:cs="微软雅黑" w:hint="eastAsia"/>
-          <w:lang w:eastAsia="zh-CN"/>
-        </w:rPr>
-        <w:t>换</w:t>
-      </w:r>
-      <w:r>
-        <w:rPr>
-          <w:rFonts w:ascii="MS Gothic" w:eastAsia="MS Gothic" w:hAnsi="MS Gothic" w:cs="MS Gothic" w:hint="eastAsia"/>
-          <w:lang w:eastAsia="zh-CN"/>
-        </w:rPr>
-        <w:t>机</w:t>
-      </w:r>
-      <w:r>
-        <w:rPr>
-          <w:rFonts w:hint="eastAsia"/>
-          <w:lang w:eastAsia="zh-CN"/>
-        </w:rPr>
-        <w:t>在同一网段（</w:t>
-      </w:r>
-      <w:r>
-        <w:rPr>
-          <w:lang w:eastAsia="zh-CN"/>
-        </w:rPr>
-        <w:t>如交换机</w:t>
-      </w:r>
-      <w:r>
-        <w:rPr>
-          <w:lang w:eastAsia="zh-CN"/>
-        </w:rPr>
-        <w:t>IP</w:t>
-      </w:r>
-      <w:r>
-        <w:rPr>
-          <w:lang w:eastAsia="zh-CN"/>
-        </w:rPr>
-        <w:t>：</w:t>
-      </w:r>
-      <w:r>
-        <w:rPr>
-          <w:rFonts w:hint="eastAsia"/>
-          <w:lang w:eastAsia="zh-CN"/>
-        </w:rPr>
-        <w:t>1</w:t>
-      </w:r>
-      <w:r>
-        <w:rPr>
-          <w:lang w:eastAsia="zh-CN"/>
-        </w:rPr>
-        <w:t>92.168.1.120</w:t>
-      </w:r>
-      <w:r>
-        <w:rPr>
-          <w:lang w:eastAsia="zh-CN"/>
-        </w:rPr>
-        <w:t>，本机配置</w:t>
-      </w:r>
-      <w:r>
-        <w:rPr>
-          <w:lang w:eastAsia="zh-CN"/>
-        </w:rPr>
-        <w:t>IP</w:t>
-      </w:r>
-      <w:r>
-        <w:rPr>
-          <w:lang w:eastAsia="zh-CN"/>
-        </w:rPr>
-        <w:t>：</w:t>
-      </w:r>
-      <w:r>
-        <w:rPr>
-          <w:rFonts w:hint="eastAsia"/>
-          <w:lang w:eastAsia="zh-CN"/>
-        </w:rPr>
-        <w:t>1</w:t>
-      </w:r>
-      <w:r>
-        <w:rPr>
-          <w:lang w:eastAsia="zh-CN"/>
-        </w:rPr>
-        <w:t>92.168.1.50</w:t>
-      </w:r>
-      <w:r>
-        <w:rPr>
-          <w:lang w:eastAsia="zh-CN"/>
-        </w:rPr>
-        <w:t>），</w:t>
-      </w:r>
-      <w:r>
-        <w:rPr>
-          <w:lang w:eastAsia="zh-CN"/>
-        </w:rPr>
-        <w:t>并</w:t>
-      </w:r>
-      <w:r>
-        <w:rPr>
-          <w:lang w:eastAsia="zh-CN"/>
-        </w:rPr>
-        <w:t>确保可</w:t>
-      </w:r>
-      <w:r>
-        <w:rPr>
-          <w:lang w:eastAsia="zh-CN"/>
-        </w:rPr>
-        <w:t xml:space="preserve"> ping </w:t>
-      </w:r>
-      <w:r>
-        <w:rPr>
-          <w:lang w:eastAsia="zh-CN"/>
-        </w:rPr>
-        <w:t>通</w:t>
-      </w:r>
-      <w:r>
-        <w:rPr>
-          <w:rFonts w:hint="eastAsia"/>
-          <w:lang w:eastAsia="zh-CN"/>
-        </w:rPr>
-        <w:t>交</w:t>
-      </w:r>
-      <w:r>
-        <w:rPr>
-          <w:rFonts w:ascii="微软雅黑" w:eastAsia="微软雅黑" w:hAnsi="微软雅黑" w:cs="微软雅黑" w:hint="eastAsia"/>
-          <w:lang w:eastAsia="zh-CN"/>
-        </w:rPr>
-        <w:t>换</w:t>
-      </w:r>
-      <w:r>
-        <w:rPr>
-          <w:rFonts w:ascii="MS Gothic" w:eastAsia="MS Gothic" w:hAnsi="MS Gothic" w:cs="MS Gothic" w:hint="eastAsia"/>
-          <w:lang w:eastAsia="zh-CN"/>
-        </w:rPr>
-        <w:t>机</w:t>
-      </w:r>
-      <w:r>
-        <w:rPr>
-          <w:lang w:eastAsia="zh-CN"/>
-        </w:rPr>
-        <w:t>。</w:t>
       </w:r>
     </w:p>
     <w:p>
@@ -2341,6 +2335,16 @@
           <w:lang w:eastAsia="zh-CN"/>
         </w:rPr>
       </w:pPr>
+      <w:r>
+        <w:rPr>
+          <w:rFonts w:ascii="微软雅黑" w:eastAsia="微软雅黑" w:hAnsi="微软雅黑" w:cs="微软雅黑"/>
+          <w:b/>
+          <w:lang w:eastAsia="zh-CN"/>
+        </w:rPr>
+        <w:t>软件</w:t>
+      </w:r>
+      <w:bookmarkStart w:id="0" w:name="_GoBack"/>
+      <w:bookmarkEnd w:id="0"/>
       <w:r>
         <w:rPr>
           <w:rFonts w:ascii="微软雅黑" w:eastAsia="微软雅黑" w:hAnsi="微软雅黑" w:cs="微软雅黑"/>
@@ -18732,7 +18736,7 @@
 </file>
 
 <file path=customXml/itemProps1.xml><?xml version="1.0" encoding="utf-8"?>
-<ds:datastoreItem xmlns:ds="http://schemas.openxmlformats.org/officeDocument/2006/customXml" ds:itemID="{982632C6-0F42-4502-A9DA-8FC97DB75C07}">
+<ds:datastoreItem xmlns:ds="http://schemas.openxmlformats.org/officeDocument/2006/customXml" ds:itemID="{24C6EFC1-E30C-4437-880C-EBEC90452F2C}">
   <ds:schemaRefs>
     <ds:schemaRef ds:uri="http://schemas.openxmlformats.org/officeDocument/2006/bibliography"/>
   </ds:schemaRefs>

</xml_diff>